<commit_message>
feat: deliver bootfix evidence AI logs video and Apache license
Signed-off-by: yangshuxuan1024 <284936491+yangshuxuan1024@users.noreply.github.com>
</commit_message>
<xml_diff>
--- a/docs/小小指挥家队-小小指挥家-作品提交文档.docx
+++ b/docs/小小指挥家队-小小指挥家-作品提交文档.docx
@@ -47,13 +47,13 @@
           <w:szCs w:val="22"/>
           <w:color w:val="000000"/>
         </w:rPr>
-        <w:t xml:space="preserve">参赛队伍  小小指挥家队</w:t>
+        <w:t>队伍名称  小小指挥家队</w:t>
         <w:br/>
-        <w:t xml:space="preserve">参赛赛道  手表应用创新开发赛道</w:t>
+        <w:t>赛道方向  手表应用创新</w:t>
         <w:br/>
-        <w:t xml:space="preserve">作品名称  小小指挥家</w:t>
+        <w:t>作品名称  小小指挥家</w:t>
         <w:br/>
-        <w:t xml:space="preserve">提交版本与日期  v28 original／电脑端源码  2026 年 9 月 18 日</w:t>
+        <w:t>最终运行版本  v28 bootfix 与电脑端源码  2026 年 9 月 18 日</w:t>
       </w:r>
     </w:p>
     <w:p>
@@ -104,7 +104,7 @@
           <w:szCs w:val="22"/>
           <w:color w:val="000000"/>
         </w:rPr>
-        <w:t>小小指挥家是一款以管弦乐指挥为主题的体感节奏游戏。玩家跟随音乐和屏幕提示挥动手腕，开发板采集六轴惯性数据并产生拍点事件，电脑端将事件接入既有谱面判定与游戏反馈。项目基于 openvela 完成板端适配、动作事件处理及应用集成，历史测试已通过串口桥接完成团结引擎编辑器内的真实交互闭环。本次提交采用 v28 original 构建产物，历史联调固件及其验证范围另行标明。项目面向休闲娱乐与音乐节奏体验，不作为专业指挥技能评价工具。AI 用于编程及图片、动画制作，不作为产品运行功能。</w:t>
+        <w:t>小小指挥家是一款以管弦乐指挥为主题的体感节奏游戏。玩家根据音乐和屏幕提示挥动手腕，开发板采集惯性传感器数据并生成拍点事件，电脑端将事件接入谱面判定与游戏反馈。项目基于 openvela 完成板端适配、动作事件输出与应用集成，使用团结引擎完成电脑交互。最终运行基准为 v28 bootfix，其实机记录纳入最终交付证据；original 构建作为原布局对照保留。项目面向娱乐与音乐节奏体验，不作为专业指挥技能评价工具。AI 用于编程及图片、动画素材生成，不作为产品运行功能。</w:t>
       </w:r>
     </w:p>
     <w:p>
@@ -906,7 +906,7 @@
           <w:szCs w:val="22"/>
           <w:color w:val="000000"/>
         </w:rPr>
-        <w:t xml:space="preserve">项目在既有黄山开发板和 openvela 环境上完成外设、应用及相关软件路径的适配，不申报新芯片平台移植或自研整板。本次提交为 v28 original：仅通过 const-allsyms 修复解决符号表占用 SRAM 导致的链接溢出，ARM／allsyms 构建已完成，原有链接布局保持不变。该产物尚未完成启动布局兼容性检查，不标记为固定启动区烧录候选。bootfix 不纳入本次固件提交。</w:t>
+        <w:t>项目在嘉立创黄山派已有 openvela 支持基础上，对外设、应用集成和运行路径进行适配，不申报为新芯片平台移植。最终运行版本为 v28 bootfix，使用已验证的固定启动布局及 ARM／allsyms 构建产物。original 的 const-allsyms 修复与原链接布局作为对照归档保留，不替代 bootfix 的部署入口。</w:t>
       </w:r>
     </w:p>
     <w:tbl>
@@ -1148,7 +1148,7 @@
                 <w:szCs w:val="22"/>
                 <w:color w:val="000000"/>
               </w:rPr>
-              <w:t xml:space="preserve">历史实测条件</w:t>
+              <w:t>实测条件</w:t>
             </w:r>
           </w:p>
         </w:tc>
@@ -1216,7 +1216,7 @@
                 <w:szCs w:val="22"/>
                 <w:color w:val="000000"/>
               </w:rPr>
-              <w:t xml:space="preserve">rank1_v28_original_20260917；已完成构建，尚未完成启动布局兼容性检查及实机验收。</w:t>
+              <w:t>rank1_v28_bootfix_20260917；ARM／allsyms 构建通过，实机证据见第三节；original 为原布局对照。</w:t>
             </w:r>
           </w:p>
         </w:tc>
@@ -1252,7 +1252,7 @@
           <w:szCs w:val="22"/>
           <w:color w:val="000000"/>
         </w:rPr>
-        <w:t xml:space="preserve">以下是历史 v28 bootfix 的两个 C 模式观测窗口，来自用户提供的串口记录摘录。它们仅说明所列条件下的数据流进展和计数状态，不代表 v28 original 已通过实机验收，也不能扩展为所有模式或长时间运行保证。</w:t>
+        <w:t>以下为最终提交 v28 bootfix 的两次 C 模式实机观察窗口，依据用户提供的原始串口记录摘录。结论仅限记录中的采集、队列计数与运行条件，不扩展为所有模式的长期运行保证。</w:t>
       </w:r>
     </w:p>
     <w:tbl>
@@ -1812,7 +1812,7 @@
           <w:szCs w:val="22"/>
           <w:color w:val="000000"/>
         </w:rPr>
-        <w:t xml:space="preserve">本次 v28 original 最终 BIN 大小为 2,557,620 字节，已与交付归档核验一致。SHA256 如下，用于核对文件；构建成功不替代启动布局检查或实际烧录验收。</w:t>
+        <w:t>最终运行固件 v28 bootfix 的 BIN 大小为 2,557,596 字节，归档与构建输出一致。SHA-256 如下。实机 READY 记录同一 build_id；当时未单独保留已烧录 Flash 的逐字节哈希绑定。</w:t>
       </w:r>
     </w:p>
     <w:p>
@@ -1827,9 +1827,9 @@
           <w:szCs w:val="20"/>
           <w:color w:val="000000"/>
         </w:rPr>
-        <w:t xml:space="preserve">77b8bb24c4e4dd136d0d6a406433986c066</w:t>
+        <w:t>3aed7f0574e906820c364eef8412faaa25de</w:t>
         <w:br/>
-        <w:t xml:space="preserve">81edbb3ac2fb18c253d3ffd7bf5ea</w:t>
+        <w:t>92414de688615bafdc2bf8d1a8d1</w:t>
       </w:r>
     </w:p>
     <w:p>
@@ -1862,7 +1862,7 @@
           <w:szCs w:val="22"/>
           <w:color w:val="000000"/>
         </w:rPr>
-        <w:t xml:space="preserve">2026 年 9 月 18 日，历史 v28 bootfix 固件与团结引擎 1.10.0／2022.3.62t12 编辑器 Play 模式下的 scene8 完成实机联调。开发板会话为 29778，固件标识为 rank1_v28_bootfix_20260917，修正版应用标识为 bte-desktop-2-qpc。以下数据仅属于该历史组合，不移用为 original 固件验收结论。</w:t>
+        <w:t>2026 年 9 月 18 日，v28 bootfix 与团结引擎 1.10.0／2022.3.62t12 的编辑器 Play 模式完成实机联调。会话为 29778，固件标识为 rank1_v28_bootfix_20260917，桌面应用标识为 bte-desktop-2-qpc。该组为最终 bootfix 交付的实机证据，原始测试使用删曲前 scene8；当前复现入口为 scene9，不将历史七条结果改写为删曲后验收。</w:t>
       </w:r>
     </w:p>
     <w:tbl>
@@ -2628,7 +2628,7 @@
                 <w:szCs w:val="22"/>
                 <w:color w:val="000000"/>
               </w:rPr>
-              <w:t xml:space="preserve">设备与主机时钟映射、板端 PENDING／积压、BLE 停止重启与 Android 联调仍存在待验证事项。本次冻结算法、BLE、连接及状态机，不继续优化。</w:t>
+              <w:t>设备与主机时钟映射、板端 PENDING／积压、BLE 停止重启、Android 联调和 scene1／scene2 跳转（ISS-051）仍待处理。本次不优化算法、BLE、连接或状态机。</w:t>
             </w:r>
           </w:p>
         </w:tc>
@@ -3086,7 +3086,7 @@
                 <w:szCs w:val="22"/>
                 <w:color w:val="000000"/>
               </w:rPr>
-              <w:t xml:space="preserve">已完成部分原始日志保全与校验；官方采集工具对现有 Codex 日志的解析与历史补录存在兼容性待确认事项，尚未形成完整官方提交日志。</w:t>
+              <w:t>已提交 30 个 Codex 会话、37,828 条记录；54 个按日期分组的 JSONL 通过官方校验器。历史手动适配及覆盖范围如实披露，不等于全部开发记录。</w:t>
             </w:r>
           </w:p>
         </w:tc>
@@ -3340,7 +3340,7 @@
                 <w:szCs w:val="22"/>
                 <w:color w:val="000000"/>
               </w:rPr>
-              <w:t xml:space="preserve">核对 28 字节 BTE1 payload；禁止进入旧 39 字节解析器；确认玩法场景为 scene8 至 scene10。</w:t>
+              <w:t>核对 28 字节 BTE1 payload；禁止进入旧 39 字节解析器。当前入口 scene9；历史 scene8 已清空被移除曲目，保留索引。</w:t>
             </w:r>
           </w:p>
         </w:tc>
@@ -4323,7 +4323,7 @@
           <w:szCs w:val="22"/>
           <w:color w:val="000000"/>
         </w:rPr>
-        <w:t xml:space="preserve">既有提交 PR #3 保留早期版本。新版交付候选已整理 v28 original 源码、构建产物、依赖补丁、电脑端工程和 Skill；尚未上传，不将旧 PR 状态等同于新版提交完成。</w:t>
+        <w:t>新版源码、固件、桌面工程、Skill 和作品文档通过 PR #3 提交。本轮增补 bootfix 运行版本、原始测试证据、演示视频、实际 AI 日志及 Apache 2.0 许可文件；是否合入以 GitHub PR 状态为准。</w:t>
       </w:r>
     </w:p>
     <w:p>
@@ -4386,7 +4386,7 @@
           <w:szCs w:val="22"/>
           <w:color w:val="000000"/>
         </w:rPr>
-        <w:t>自有代码按赛事 Apache 2.0 要求准备开源；第三方代码和字体沿用各自许可。Unity 工程已移除《义勇军进行曲》的选项、配置与音频。</w:t>
+        <w:t>团队拥有授权权利的原创代码、工具、Skill 与文档采用 Apache License 2.0，仓库提供 LICENSE 和 NOTICE。第三方组件保留原有许可，根目录许可证不重新授权第三方录音、素材或引擎。Unity 已移除《义勇军进行曲》的选项、配置和音频。</w:t>
       </w:r>
     </w:p>
     <w:p>
@@ -4454,7 +4454,7 @@
           <w:szCs w:val="22"/>
           <w:color w:val="000000"/>
         </w:rPr>
-        <w:t xml:space="preserve">2. 核对固件版本、文件校验值和目标板启动布局。v28 original 已完成构建，但尚未通过启动布局兼容性检查，不可仅依据本文直接烧录到固定启动区。使用已确认兼容的测试环境后，连接开发板，在系统设备列表中查询实际串口名称，关闭其他占用该串口的程序。</w:t>
+        <w:t>2. 使用交付的 v28 bootfix 固件，先核对 SHA-256、目标板型号与固定启动布局。部署和源码准备见 docs/通用复现步骤.md；不要将 original 对照固件写入固定启动布局。连接开发板，在系统设备列表中查询实际串口名称，并关闭其他占用该串口的程序。</w:t>
       </w:r>
     </w:p>
     <w:p>
@@ -4551,7 +4551,7 @@
           <w:szCs w:val="22"/>
           <w:color w:val="000000"/>
         </w:rPr>
-        <w:t xml:space="preserve">板端内容位于交付包 board_original 目录：source 保存新增或修改源码，patches 保存依赖补丁，build_config 保存配置，artifacts/v28_original 保存构建产物，build_record 保存构建记录。依赖版本与恢复要求见交付说明；历史构建缓存不能直接作为其他电脑的构建入口。</w:t>
+        <w:t>板端应用在 app/openvela_ble_probe，当前配置在 board/v28_bootfix，固件在 artifacts/v28_bootfix；original 对照单独保留。dependencies/source_delta 和 patches 保存公共依赖修改，manifest 固定相关基线并映射团队应用。源码准备步骤可迁移至用户工作区；全新环境编译尚未执行，不以历史构建成功代替干净环境验证。</w:t>
       </w:r>
     </w:p>
     <w:p>
@@ -4566,7 +4566,7 @@
           <w:szCs w:val="22"/>
           <w:color w:val="000000"/>
         </w:rPr>
-        <w:t xml:space="preserve">电脑工程位于交付包 desktop_project 目录。工具说明见工程内 BteIntegration/README.md；Skill 位于 BteIntegration/skills/v28-bte-desktop/SKILL.md。路径均相对于交付包或工程根目录。</w:t>
+        <w:t>电脑工程位于 desktop，工具说明为 desktop/BteIntegration/README.md，Skill 为其中 skills/v28-bte-desktop/SKILL.md。通用命令使用实际串口和相对目录，不依赖开发者本机路径。</w:t>
       </w:r>
     </w:p>
     <w:p>
@@ -4581,7 +4581,7 @@
           <w:szCs w:val="22"/>
           <w:color w:val="000000"/>
         </w:rPr>
-        <w:t xml:space="preserve">每次运行保留 serial.bin、bridge.jsonl、summary.json 及对应的 unity_*.jsonl。对账汇总与文件清单应记录本次版本、会话及校验值；历史证据单独存放，不作为新版本已经通过验收的证明。</w:t>
+        <w:t>最终 bootfix 实机证据位于 evidence/v28_bootfix，包含原始串口、桥接、Unity 日志与逐事件对账。证据文件保持原样，历史路径与场景名用于取证，不作为当前运行命令。不同固件、场景和模拟输入的结果分别记录。</w:t>
       </w:r>
     </w:p>
     <w:p>
@@ -4629,7 +4629,7 @@
           <w:szCs w:val="22"/>
           <w:color w:val="000000"/>
         </w:rPr>
-        <w:t>演示视频已录制完成，包含硬件展示。视频按不超过 5 分钟的要求提交，实际时长以最终视频文件为准。原始 AI Coding 日志及新版 PR 另行整理。AI 使用说明包括编程协作及即梦 AI 图片、动画制作。</w:t>
+        <w:t>演示视频位于 media/小小指挥家演示.mp4，时长 137.213 秒，团队确认包含硬件展示。AI 日志位于 logs/yangshuxuan1024，含 30 个会话、37,828 条记录，按原始日期分为 54 个 JSONL，官方格式校验通过；属于部分历史适配，不代表全项目完整日志或官方已认可有效工时。</w:t>
       </w:r>
     </w:p>
     <w:sectPr>

</xml_diff>

<commit_message>
docs: simplify final submission descriptions
Signed-off-by: yangshuxuan1024 <284936491+yangshuxuan1024@users.noreply.github.com>
</commit_message>
<xml_diff>
--- a/docs/小小指挥家队-小小指挥家-作品提交文档.docx
+++ b/docs/小小指挥家队-小小指挥家-作品提交文档.docx
@@ -1862,7 +1862,7 @@
           <w:szCs w:val="22"/>
           <w:color w:val="000000"/>
         </w:rPr>
-        <w:t>2026 年 9 月 18 日，v28 bootfix 与团结引擎 1.10.0／2022.3.62t12 的编辑器 Play 模式完成实机联调。会话为 29778，固件标识为 rank1_v28_bootfix_20260917，桌面应用标识为 bte-desktop-2-qpc。该组为最终 bootfix 交付的实机证据，原始测试使用删曲前 scene8；当前复现入口为 scene9，不将历史七条结果改写为删曲后验收。</w:t>
+        <w:t>2026 年 9 月 18 日，v28 bootfix 与团结引擎 1.10.0／2022.3.62t12 的编辑器 Play 模式完成实机联调。会话为 29778，固件标识为 rank1_v28_bootfix_20260917，桌面应用标识为 bte-desktop-2-qpc。该组为最终 bootfix 交付的实机证据，原始测试使用原实测 scene8；当前复现入口为 scene9，不将历史七条结果改写为当前场景验收。</w:t>
       </w:r>
     </w:p>
     <w:tbl>
@@ -3340,7 +3340,7 @@
                 <w:szCs w:val="22"/>
                 <w:color w:val="000000"/>
               </w:rPr>
-              <w:t>核对 28 字节 BTE1 payload；禁止进入旧 39 字节解析器。当前入口 scene9；历史 scene8 已清空被移除曲目，保留索引。</w:t>
+              <w:t>核对 28 字节 BTE1 payload；禁止进入旧 39 字节解析器。当前入口 scene9；历史 scene8 保留原场景索引。</w:t>
             </w:r>
           </w:p>
         </w:tc>
@@ -4386,7 +4386,7 @@
           <w:szCs w:val="22"/>
           <w:color w:val="000000"/>
         </w:rPr>
-        <w:t>团队拥有授权权利的原创代码、工具、Skill 与文档采用 Apache License 2.0，仓库提供 LICENSE 和 NOTICE。第三方组件保留原有许可，根目录许可证不重新授权第三方录音、素材或引擎。Unity 已移除《义勇军进行曲》的选项、配置和音频。</w:t>
+        <w:t>团队拥有授权权利的原创代码、工具、Skill 与文档采用 Apache License 2.0，仓库提供 LICENSE 和 NOTICE。第三方组件保留原有许可，根目录许可证不重新授权第三方录音、素材或引擎。</w:t>
       </w:r>
     </w:p>
     <w:p>

</xml_diff>